<commit_message>
79 - Updated documentation
</commit_message>
<xml_diff>
--- a/documentation/Sprint6.docx
+++ b/documentation/Sprint6.docx
@@ -50,7 +50,7 @@
           <w:sz w:val="28"/>
           <w:szCs w:val="28"/>
         </w:rPr>
-        <w:t xml:space="preserve"> Part 1</w:t>
+        <w:t xml:space="preserve"> </w:t>
       </w:r>
       <w:r>
         <w:rPr>
@@ -60,7 +60,7 @@
           <w:sz w:val="28"/>
           <w:szCs w:val="28"/>
         </w:rPr>
-        <w:t xml:space="preserve"> – </w:t>
+        <w:t xml:space="preserve">– </w:t>
       </w:r>
       <w:r>
         <w:rPr>
@@ -72,6 +72,16 @@
         </w:rPr>
         <w:t>Elastic Search</w:t>
       </w:r>
+      <w:r>
+        <w:rPr>
+          <w:rFonts w:asciiTheme="majorHAnsi" w:hAnsiTheme="majorHAnsi"/>
+          <w:b/>
+          <w:bCs/>
+          <w:sz w:val="28"/>
+          <w:szCs w:val="28"/>
+        </w:rPr>
+        <w:t>, Users (Special Use Case)</w:t>
+      </w:r>
     </w:p>
     <w:p>
       <w:r>
@@ -106,17 +116,13 @@
         <w:t>Sprint duration</w:t>
       </w:r>
       <w:r>
-        <w:t xml:space="preserve">: </w:t>
-      </w:r>
-      <w:r>
-        <w:t>12</w:t>
-      </w:r>
-      <w:r>
-        <w:t xml:space="preserve">.12.2025 – </w:t>
-      </w:r>
-      <w:r>
-        <w:t xml:space="preserve"> 08.01.2026</w:t>
-      </w:r>
+        <w:t xml:space="preserve">: 12.12.2025 </w:t>
+      </w:r>
+      <w:proofErr w:type="gramStart"/>
+      <w:r>
+        <w:t>–  08.01.2026</w:t>
+      </w:r>
+      <w:proofErr w:type="gramEnd"/>
     </w:p>
     <w:p>
       <w:r>
@@ -130,210 +136,7 @@
         <w:t>: 6 h / person / week</w:t>
       </w:r>
     </w:p>
-    <w:p>
-      <w:pPr>
-        <w:rPr>
-          <w:b/>
-          <w:bCs/>
-          <w:lang w:val="en-AT"/>
-        </w:rPr>
-      </w:pPr>
-      <w:r>
-        <w:rPr>
-          <w:b/>
-          <w:bCs/>
-          <w:lang w:val="en-AT"/>
-        </w:rPr>
-        <w:t>Sprint Goal</w:t>
-      </w:r>
-    </w:p>
-    <w:p>
-      <w:pPr>
-        <w:rPr>
-          <w:lang w:val="en-AT"/>
-        </w:rPr>
-      </w:pPr>
-      <w:r>
-        <w:rPr>
-          <w:lang w:val="en-AT"/>
-        </w:rPr>
-        <w:t>Introduce text search using Elasticsearch. Index document title, OCR text, and summary</w:t>
-      </w:r>
-      <w:r>
-        <w:rPr>
-          <w:lang w:val="en-AT"/>
-        </w:rPr>
-        <w:t>.</w:t>
-      </w:r>
-    </w:p>
-    <w:p>
-      <w:pPr>
-        <w:rPr>
-          <w:b/>
-          <w:bCs/>
-          <w:lang w:val="en-AT"/>
-        </w:rPr>
-      </w:pPr>
-      <w:r>
-        <w:rPr>
-          <w:b/>
-          <w:bCs/>
-          <w:lang w:val="en-AT"/>
-        </w:rPr>
-        <w:t>Completed Work (bullet list)</w:t>
-      </w:r>
-    </w:p>
-    <w:p>
-      <w:pPr>
-        <w:numPr>
-          <w:ilvl w:val="0"/>
-          <w:numId w:val="6"/>
-        </w:numPr>
-        <w:rPr>
-          <w:lang w:val="en-AT"/>
-        </w:rPr>
-      </w:pPr>
-      <w:r>
-        <w:rPr>
-          <w:lang w:val="en-AT"/>
-        </w:rPr>
-        <w:t xml:space="preserve">Added paperless-elasticsearch service to docker-compose.yml </w:t>
-      </w:r>
-    </w:p>
-    <w:p>
-      <w:pPr>
-        <w:numPr>
-          <w:ilvl w:val="0"/>
-          <w:numId w:val="6"/>
-        </w:numPr>
-        <w:rPr>
-          <w:lang w:val="en-AT"/>
-        </w:rPr>
-      </w:pPr>
-      <w:r>
-        <w:rPr>
-          <w:lang w:val="en-AT"/>
-        </w:rPr>
-        <w:t>Implemented indexing pipeline:</w:t>
-      </w:r>
-    </w:p>
-    <w:p>
-      <w:pPr>
-        <w:numPr>
-          <w:ilvl w:val="1"/>
-          <w:numId w:val="6"/>
-        </w:numPr>
-        <w:rPr>
-          <w:lang w:val="en-AT"/>
-        </w:rPr>
-      </w:pPr>
-      <w:r>
-        <w:rPr>
-          <w:lang w:val="en-AT"/>
-        </w:rPr>
-        <w:t>On document creation: index {Id, Title, Summary}.</w:t>
-      </w:r>
-    </w:p>
-    <w:p>
-      <w:pPr>
-        <w:numPr>
-          <w:ilvl w:val="1"/>
-          <w:numId w:val="6"/>
-        </w:numPr>
-        <w:rPr>
-          <w:lang w:val="en-AT"/>
-        </w:rPr>
-      </w:pPr>
-      <w:r>
-        <w:rPr>
-          <w:lang w:val="en-AT"/>
-        </w:rPr>
-        <w:t>On OCR completion: re-index {Id, Title, Summary, OcrText}.</w:t>
-      </w:r>
-    </w:p>
-    <w:p>
-      <w:pPr>
-        <w:numPr>
-          <w:ilvl w:val="0"/>
-          <w:numId w:val="6"/>
-        </w:numPr>
-        <w:rPr>
-          <w:lang w:val="en-AT"/>
-        </w:rPr>
-      </w:pPr>
-      <w:r>
-        <w:rPr>
-          <w:lang w:val="en-AT"/>
-        </w:rPr>
-        <w:t>Implemented search endpoint:</w:t>
-      </w:r>
-    </w:p>
-    <w:p>
-      <w:pPr>
-        <w:numPr>
-          <w:ilvl w:val="1"/>
-          <w:numId w:val="6"/>
-        </w:numPr>
-        <w:rPr>
-          <w:lang w:val="en-AT"/>
-        </w:rPr>
-      </w:pPr>
-      <w:r>
-        <w:rPr>
-          <w:lang w:val="en-AT"/>
-        </w:rPr>
-        <w:t xml:space="preserve">GET /api/documents/search?q=... </w:t>
-      </w:r>
-    </w:p>
-    <w:p>
-      <w:pPr>
-        <w:numPr>
-          <w:ilvl w:val="0"/>
-          <w:numId w:val="6"/>
-        </w:numPr>
-        <w:rPr>
-          <w:lang w:val="en-AT"/>
-        </w:rPr>
-      </w:pPr>
-      <w:r>
-        <w:rPr>
-          <w:lang w:val="en-AT"/>
-        </w:rPr>
-        <w:t>Added integration test steps / manual test procedure.</w:t>
-      </w:r>
-    </w:p>
-    <w:p>
-      <w:pPr>
-        <w:rPr>
-          <w:lang w:val="en-AT"/>
-        </w:rPr>
-      </w:pPr>
-      <w:r>
-        <w:rPr>
-          <w:lang w:val="en-AT"/>
-        </w:rPr>
-        <w:t>Acceptance Criteria</w:t>
-      </w:r>
-    </w:p>
-    <w:p>
-      <w:pPr>
-        <w:numPr>
-          <w:ilvl w:val="0"/>
-          <w:numId w:val="7"/>
-        </w:numPr>
-        <w:rPr>
-          <w:b/>
-          <w:bCs/>
-          <w:lang w:val="en-AT"/>
-        </w:rPr>
-      </w:pPr>
-      <w:r>
-        <w:rPr>
-          <w:lang w:val="en-AT"/>
-        </w:rPr>
-        <w:t>Search returns documents by title/summary/OCR text.</w:t>
-      </w:r>
-    </w:p>
+    <w:p/>
     <w:p>
       <w:pPr>
         <w:rPr>
@@ -346,7 +149,497 @@
           <w:b/>
           <w:bCs/>
         </w:rPr>
-        <w:t>6. Workload (Estimate)</w:t>
+        <w:t xml:space="preserve">1. </w:t>
+      </w:r>
+      <w:r>
+        <w:rPr>
+          <w:b/>
+          <w:bCs/>
+        </w:rPr>
+        <w:t>Sprint Goal</w:t>
+      </w:r>
+      <w:r>
+        <w:rPr>
+          <w:b/>
+          <w:bCs/>
+        </w:rPr>
+        <w:t xml:space="preserve"> (from assignment)</w:t>
+      </w:r>
+    </w:p>
+    <w:p>
+      <w:pPr>
+        <w:pStyle w:val="ListParagraph"/>
+        <w:numPr>
+          <w:ilvl w:val="0"/>
+          <w:numId w:val="8"/>
+        </w:numPr>
+      </w:pPr>
+      <w:r>
+        <w:t>Introduce text search using Elasticsearch</w:t>
+      </w:r>
+    </w:p>
+    <w:p>
+      <w:pPr>
+        <w:pStyle w:val="ListParagraph"/>
+        <w:numPr>
+          <w:ilvl w:val="0"/>
+          <w:numId w:val="8"/>
+        </w:numPr>
+      </w:pPr>
+      <w:r>
+        <w:t xml:space="preserve">Index </w:t>
+      </w:r>
+      <w:r>
+        <w:t>document properties which ought to be searchable</w:t>
+      </w:r>
+    </w:p>
+    <w:p>
+      <w:pPr>
+        <w:pStyle w:val="ListParagraph"/>
+        <w:numPr>
+          <w:ilvl w:val="0"/>
+          <w:numId w:val="8"/>
+        </w:numPr>
+      </w:pPr>
+      <w:r>
+        <w:t>Make search available in the frontend</w:t>
+      </w:r>
+    </w:p>
+    <w:p>
+      <w:pPr>
+        <w:pStyle w:val="ListParagraph"/>
+        <w:numPr>
+          <w:ilvl w:val="0"/>
+          <w:numId w:val="8"/>
+        </w:numPr>
+      </w:pPr>
+      <w:r>
+        <w:t>Implement special use case: Users</w:t>
+      </w:r>
+    </w:p>
+    <w:p>
+      <w:pPr>
+        <w:pStyle w:val="ListParagraph"/>
+        <w:numPr>
+          <w:ilvl w:val="1"/>
+          <w:numId w:val="8"/>
+        </w:numPr>
+      </w:pPr>
+      <w:r>
+        <w:t>Only users may upload</w:t>
+      </w:r>
+    </w:p>
+    <w:p>
+      <w:pPr>
+        <w:pStyle w:val="ListParagraph"/>
+        <w:numPr>
+          <w:ilvl w:val="1"/>
+          <w:numId w:val="8"/>
+        </w:numPr>
+      </w:pPr>
+      <w:r>
+        <w:t>Only users may search</w:t>
+      </w:r>
+    </w:p>
+    <w:p>
+      <w:pPr>
+        <w:pStyle w:val="ListParagraph"/>
+        <w:numPr>
+          <w:ilvl w:val="1"/>
+          <w:numId w:val="8"/>
+        </w:numPr>
+      </w:pPr>
+      <w:r>
+        <w:t>Users may only see documents they themselves have uploaded (whether via the overview or search)</w:t>
+      </w:r>
+    </w:p>
+    <w:p/>
+    <w:p>
+      <w:pPr>
+        <w:rPr>
+          <w:b/>
+          <w:bCs/>
+        </w:rPr>
+      </w:pPr>
+      <w:r>
+        <w:rPr>
+          <w:b/>
+          <w:bCs/>
+        </w:rPr>
+        <w:t>2. Implemented Work</w:t>
+      </w:r>
+    </w:p>
+    <w:p>
+      <w:pPr>
+        <w:rPr>
+          <w:b/>
+          <w:bCs/>
+        </w:rPr>
+      </w:pPr>
+      <w:proofErr w:type="spellStart"/>
+      <w:r>
+        <w:rPr>
+          <w:b/>
+          <w:bCs/>
+        </w:rPr>
+        <w:t>ElasticSearch</w:t>
+      </w:r>
+      <w:proofErr w:type="spellEnd"/>
+    </w:p>
+    <w:p>
+      <w:pPr>
+        <w:pStyle w:val="ListParagraph"/>
+        <w:numPr>
+          <w:ilvl w:val="0"/>
+          <w:numId w:val="9"/>
+        </w:numPr>
+      </w:pPr>
+      <w:r>
+        <w:t>Added paperless-</w:t>
+      </w:r>
+      <w:proofErr w:type="spellStart"/>
+      <w:r>
+        <w:t>elasticsearch</w:t>
+      </w:r>
+      <w:proofErr w:type="spellEnd"/>
+      <w:r>
+        <w:t xml:space="preserve"> service to docker-</w:t>
+      </w:r>
+      <w:proofErr w:type="spellStart"/>
+      <w:r>
+        <w:t>compose.yml</w:t>
+      </w:r>
+      <w:proofErr w:type="spellEnd"/>
+    </w:p>
+    <w:p>
+      <w:pPr>
+        <w:pStyle w:val="ListParagraph"/>
+        <w:numPr>
+          <w:ilvl w:val="0"/>
+          <w:numId w:val="9"/>
+        </w:numPr>
+      </w:pPr>
+      <w:r>
+        <w:t xml:space="preserve">Added </w:t>
+      </w:r>
+      <w:proofErr w:type="spellStart"/>
+      <w:r>
+        <w:t>DocumentSearchModel</w:t>
+      </w:r>
+      <w:proofErr w:type="spellEnd"/>
+      <w:r>
+        <w:t xml:space="preserve"> which is used for interaction with the </w:t>
+      </w:r>
+      <w:proofErr w:type="spellStart"/>
+      <w:r>
+        <w:t>ElasticSearch</w:t>
+      </w:r>
+      <w:proofErr w:type="spellEnd"/>
+      <w:r>
+        <w:t xml:space="preserve"> DB. Functionally identical to </w:t>
+      </w:r>
+      <w:proofErr w:type="spellStart"/>
+      <w:r>
+        <w:t>DocumentModel</w:t>
+      </w:r>
+      <w:proofErr w:type="spellEnd"/>
+      <w:r>
+        <w:t>, but thus decoupled from Postgres DB</w:t>
+      </w:r>
+    </w:p>
+    <w:p>
+      <w:pPr>
+        <w:pStyle w:val="ListParagraph"/>
+        <w:numPr>
+          <w:ilvl w:val="0"/>
+          <w:numId w:val="9"/>
+        </w:numPr>
+      </w:pPr>
+      <w:r>
+        <w:t>Implemented indexing pipeline:</w:t>
+      </w:r>
+    </w:p>
+    <w:p>
+      <w:pPr>
+        <w:pStyle w:val="ListParagraph"/>
+        <w:numPr>
+          <w:ilvl w:val="1"/>
+          <w:numId w:val="9"/>
+        </w:numPr>
+      </w:pPr>
+      <w:r>
+        <w:t xml:space="preserve">On OCR </w:t>
+      </w:r>
+      <w:r>
+        <w:t>C</w:t>
+      </w:r>
+      <w:r>
+        <w:t xml:space="preserve">ompletion: </w:t>
+      </w:r>
+      <w:r>
+        <w:t>I</w:t>
+      </w:r>
+      <w:r>
+        <w:t xml:space="preserve">ndex {Id, Title, Summary, </w:t>
+      </w:r>
+      <w:proofErr w:type="spellStart"/>
+      <w:r>
+        <w:t>OcrText</w:t>
+      </w:r>
+      <w:proofErr w:type="spellEnd"/>
+      <w:r>
+        <w:t>, Tags</w:t>
+      </w:r>
+      <w:r>
+        <w:t>}</w:t>
+      </w:r>
+    </w:p>
+    <w:p>
+      <w:pPr>
+        <w:pStyle w:val="ListParagraph"/>
+        <w:numPr>
+          <w:ilvl w:val="1"/>
+          <w:numId w:val="9"/>
+        </w:numPr>
+      </w:pPr>
+      <w:r>
+        <w:t>On Document Update or Deletion: Remove relevant index</w:t>
+      </w:r>
+    </w:p>
+    <w:p>
+      <w:pPr>
+        <w:pStyle w:val="ListParagraph"/>
+        <w:numPr>
+          <w:ilvl w:val="0"/>
+          <w:numId w:val="9"/>
+        </w:numPr>
+      </w:pPr>
+      <w:r>
+        <w:t>Implemented search endpoint:</w:t>
+      </w:r>
+    </w:p>
+    <w:p>
+      <w:pPr>
+        <w:pStyle w:val="ListParagraph"/>
+        <w:numPr>
+          <w:ilvl w:val="1"/>
+          <w:numId w:val="9"/>
+        </w:numPr>
+      </w:pPr>
+      <w:r>
+        <w:t>GET /</w:t>
+      </w:r>
+      <w:proofErr w:type="spellStart"/>
+      <w:r>
+        <w:t>api</w:t>
+      </w:r>
+      <w:proofErr w:type="spellEnd"/>
+      <w:r>
+        <w:t>/documents/</w:t>
+      </w:r>
+      <w:proofErr w:type="spellStart"/>
+      <w:r>
+        <w:t>search?q</w:t>
+      </w:r>
+      <w:proofErr w:type="spellEnd"/>
+      <w:r>
+        <w:t xml:space="preserve">=... </w:t>
+      </w:r>
+    </w:p>
+    <w:p>
+      <w:pPr>
+        <w:pStyle w:val="ListParagraph"/>
+        <w:numPr>
+          <w:ilvl w:val="0"/>
+          <w:numId w:val="9"/>
+        </w:numPr>
+      </w:pPr>
+      <w:r>
+        <w:t>Added integration test steps / manual test procedure</w:t>
+      </w:r>
+    </w:p>
+    <w:p>
+      <w:pPr>
+        <w:pStyle w:val="ListParagraph"/>
+        <w:numPr>
+          <w:ilvl w:val="0"/>
+          <w:numId w:val="9"/>
+        </w:numPr>
+      </w:pPr>
+      <w:r>
+        <w:t>Search returns documents by title/summary/OCR text</w:t>
+      </w:r>
+    </w:p>
+    <w:p>
+      <w:pPr>
+        <w:pStyle w:val="ListParagraph"/>
+        <w:numPr>
+          <w:ilvl w:val="0"/>
+          <w:numId w:val="9"/>
+        </w:numPr>
+      </w:pPr>
+      <w:r>
+        <w:t>Search is available to logged-in users via the frontend, searches documents uploaded by logged-in user</w:t>
+      </w:r>
+    </w:p>
+    <w:p/>
+    <w:p>
+      <w:pPr>
+        <w:rPr>
+          <w:b/>
+          <w:bCs/>
+        </w:rPr>
+      </w:pPr>
+      <w:r>
+        <w:rPr>
+          <w:b/>
+          <w:bCs/>
+        </w:rPr>
+        <w:t>Special Use Case: Users</w:t>
+      </w:r>
+    </w:p>
+    <w:p>
+      <w:pPr>
+        <w:pStyle w:val="ListParagraph"/>
+        <w:numPr>
+          <w:ilvl w:val="0"/>
+          <w:numId w:val="10"/>
+        </w:numPr>
+      </w:pPr>
+      <w:r>
+        <w:t>Implemented backend infrastructure for storing users</w:t>
+      </w:r>
+    </w:p>
+    <w:p>
+      <w:pPr>
+        <w:pStyle w:val="ListParagraph"/>
+        <w:numPr>
+          <w:ilvl w:val="1"/>
+          <w:numId w:val="10"/>
+        </w:numPr>
+      </w:pPr>
+      <w:r>
+        <w:t>New user model was created and added to DB migration</w:t>
+      </w:r>
+    </w:p>
+    <w:p>
+      <w:pPr>
+        <w:pStyle w:val="ListParagraph"/>
+        <w:numPr>
+          <w:ilvl w:val="1"/>
+          <w:numId w:val="10"/>
+        </w:numPr>
+      </w:pPr>
+      <w:r>
+        <w:lastRenderedPageBreak/>
+        <w:t>Document model was updated so it links to users via foreign key relation</w:t>
+      </w:r>
+    </w:p>
+    <w:p>
+      <w:pPr>
+        <w:pStyle w:val="ListParagraph"/>
+        <w:numPr>
+          <w:ilvl w:val="0"/>
+          <w:numId w:val="10"/>
+        </w:numPr>
+      </w:pPr>
+      <w:r>
+        <w:t>Implemented User Creation</w:t>
+      </w:r>
+    </w:p>
+    <w:p>
+      <w:pPr>
+        <w:pStyle w:val="ListParagraph"/>
+        <w:numPr>
+          <w:ilvl w:val="1"/>
+          <w:numId w:val="10"/>
+        </w:numPr>
+      </w:pPr>
+      <w:r>
+        <w:t>Website visitors may now create a new user</w:t>
+      </w:r>
+    </w:p>
+    <w:p>
+      <w:pPr>
+        <w:pStyle w:val="ListParagraph"/>
+        <w:numPr>
+          <w:ilvl w:val="0"/>
+          <w:numId w:val="10"/>
+        </w:numPr>
+      </w:pPr>
+      <w:r>
+        <w:t>Implemented User Authentication</w:t>
+      </w:r>
+    </w:p>
+    <w:p>
+      <w:pPr>
+        <w:pStyle w:val="ListParagraph"/>
+        <w:numPr>
+          <w:ilvl w:val="1"/>
+          <w:numId w:val="10"/>
+        </w:numPr>
+      </w:pPr>
+      <w:r>
+        <w:t>Once they have created a new user, visitors may log into this user account</w:t>
+      </w:r>
+    </w:p>
+    <w:p>
+      <w:pPr>
+        <w:pStyle w:val="ListParagraph"/>
+        <w:numPr>
+          <w:ilvl w:val="1"/>
+          <w:numId w:val="10"/>
+        </w:numPr>
+      </w:pPr>
+      <w:r>
+        <w:t>Upon login, upload and search functions are available to them (but not before)</w:t>
+      </w:r>
+    </w:p>
+    <w:p>
+      <w:pPr>
+        <w:pStyle w:val="ListParagraph"/>
+        <w:numPr>
+          <w:ilvl w:val="1"/>
+          <w:numId w:val="10"/>
+        </w:numPr>
+      </w:pPr>
+      <w:r>
+        <w:t>Only documents they themselves have uploaded are visible to users</w:t>
+      </w:r>
+    </w:p>
+    <w:p>
+      <w:pPr>
+        <w:pStyle w:val="ListParagraph"/>
+        <w:numPr>
+          <w:ilvl w:val="1"/>
+          <w:numId w:val="10"/>
+        </w:numPr>
+      </w:pPr>
+      <w:r>
+        <w:t>Frontend and backend received extensive updates to facilitate this authentication</w:t>
+      </w:r>
+    </w:p>
+    <w:p/>
+    <w:p>
+      <w:pPr>
+        <w:rPr>
+          <w:b/>
+          <w:bCs/>
+        </w:rPr>
+      </w:pPr>
+      <w:r>
+        <w:rPr>
+          <w:b/>
+          <w:bCs/>
+        </w:rPr>
+        <w:t>3</w:t>
+      </w:r>
+      <w:r>
+        <w:rPr>
+          <w:b/>
+          <w:bCs/>
+        </w:rPr>
+        <w:t>. Workload (Estimate)</w:t>
       </w:r>
     </w:p>
     <w:tbl>
@@ -444,15 +737,8 @@
               </w:rPr>
             </w:pPr>
             <w:r>
-              <w:t>Sprint 5</w:t>
+              <w:t xml:space="preserve">Sprint </w:t>
             </w:r>
-          </w:p>
-        </w:tc>
-        <w:tc>
-          <w:tcPr>
-            <w:tcW w:w="2266" w:type="dxa"/>
-          </w:tcPr>
-          <w:p>
             <w:r>
               <w:t>6</w:t>
             </w:r>
@@ -464,7 +750,26 @@
           </w:tcPr>
           <w:p>
             <w:r>
-              <w:t>Elastic-Indexing</w:t>
+              <w:t>24</w:t>
+            </w:r>
+          </w:p>
+        </w:tc>
+        <w:tc>
+          <w:tcPr>
+            <w:tcW w:w="2266" w:type="dxa"/>
+          </w:tcPr>
+          <w:p>
+            <w:r>
+              <w:t>Elastic</w:t>
+            </w:r>
+            <w:r>
+              <w:t xml:space="preserve"> </w:t>
+            </w:r>
+            <w:r>
+              <w:t>Indexing</w:t>
+            </w:r>
+            <w:r>
+              <w:t>, Elastic Search, Documentation</w:t>
             </w:r>
           </w:p>
         </w:tc>
@@ -486,15 +791,8 @@
           </w:tcPr>
           <w:p>
             <w:r>
-              <w:t>Sprint 5</w:t>
+              <w:t xml:space="preserve">Sprint </w:t>
             </w:r>
-          </w:p>
-        </w:tc>
-        <w:tc>
-          <w:tcPr>
-            <w:tcW w:w="2266" w:type="dxa"/>
-          </w:tcPr>
-          <w:p>
             <w:r>
               <w:t>6</w:t>
             </w:r>
@@ -506,7 +804,20 @@
           </w:tcPr>
           <w:p>
             <w:r>
-              <w:t xml:space="preserve"> Documentation</w:t>
+              <w:t>24</w:t>
+            </w:r>
+          </w:p>
+        </w:tc>
+        <w:tc>
+          <w:tcPr>
+            <w:tcW w:w="2266" w:type="dxa"/>
+          </w:tcPr>
+          <w:p>
+            <w:r>
+              <w:t xml:space="preserve">User Creation, User Authentication, </w:t>
+            </w:r>
+            <w:r>
+              <w:t>Documentation</w:t>
             </w:r>
           </w:p>
         </w:tc>
@@ -528,6 +839,95 @@
 <file path=word/numbering.xml><?xml version="1.0" encoding="utf-8"?>
 <w:numbering xmlns:wpc="http://schemas.microsoft.com/office/word/2010/wordprocessingCanvas" xmlns:cx="http://schemas.microsoft.com/office/drawing/2014/chartex" xmlns:cx1="http://schemas.microsoft.com/office/drawing/2015/9/8/chartex" xmlns:cx2="http://schemas.microsoft.com/office/drawing/2015/10/21/chartex" xmlns:cx3="http://schemas.microsoft.com/office/drawing/2016/5/9/chartex" xmlns:cx4="http://schemas.microsoft.com/office/drawing/2016/5/10/chartex" xmlns:cx5="http://schemas.microsoft.com/office/drawing/2016/5/11/chartex" xmlns:cx6="http://schemas.microsoft.com/office/drawing/2016/5/12/chartex" xmlns:cx7="http://schemas.microsoft.com/office/drawing/2016/5/13/chartex" xmlns:cx8="http://schemas.microsoft.com/office/drawing/2016/5/14/chartex" xmlns:mc="http://schemas.openxmlformats.org/markup-compatibility/2006" xmlns:aink="http://schemas.microsoft.com/office/drawing/2016/ink" xmlns:am3d="http://schemas.microsoft.com/office/drawing/2017/model3d" xmlns:o="urn:schemas-microsoft-com:office:office" xmlns:oel="http://schemas.microsoft.com/office/2019/extlst" xmlns:r="http://schemas.openxmlformats.org/officeDocument/2006/relationships" xmlns:m="http://schemas.openxmlformats.org/officeDocument/2006/math" xmlns:v="urn:schemas-microsoft-com:vml" xmlns:wp14="http://schemas.microsoft.com/office/word/2010/wordprocessingDrawing" xmlns:wp="http://schemas.openxmlformats.org/drawingml/2006/wordprocessingDrawing" xmlns:w10="urn:schemas-microsoft-com:office:word" xmlns:w="http://schemas.openxmlformats.org/wordprocessingml/2006/main" xmlns:w14="http://schemas.microsoft.com/office/word/2010/wordml" xmlns:w15="http://schemas.microsoft.com/office/word/2012/wordml" xmlns:w16cex="http://schemas.microsoft.com/office/word/2018/wordml/cex" xmlns:w16cid="http://schemas.microsoft.com/office/word/2016/wordml/cid" xmlns:w16="http://schemas.microsoft.com/office/word/2018/wordml" xmlns:w16du="http://schemas.microsoft.com/office/word/2023/wordml/word16du" xmlns:w16sdtdh="http://schemas.microsoft.com/office/word/2020/wordml/sdtdatahash" xmlns:w16sdtfl="http://schemas.microsoft.com/office/word/2024/wordml/sdtformatlock" xmlns:w16se="http://schemas.microsoft.com/office/word/2015/wordml/symex" xmlns:wpg="http://schemas.microsoft.com/office/word/2010/wordprocessingGroup" xmlns:wpi="http://schemas.microsoft.com/office/word/2010/wordprocessingInk" xmlns:wne="http://schemas.microsoft.com/office/word/2006/wordml" xmlns:wps="http://schemas.microsoft.com/office/word/2010/wordprocessingShape" mc:Ignorable="w14 w15 w16se w16cid w16 w16cex w16sdtdh w16sdtfl w16du wp14">
   <w:abstractNum w:abstractNumId="0" w15:restartNumberingAfterBreak="0">
+    <w:nsid w:val="16543761"/>
+    <w:multiLevelType w:val="hybridMultilevel"/>
+    <w:tmpl w:val="A10CCAA4"/>
+    <w:lvl w:ilvl="0" w:tplc="2000000F">
+      <w:start w:val="1"/>
+      <w:numFmt w:val="decimal"/>
+      <w:lvlText w:val="%1."/>
+      <w:lvlJc w:val="left"/>
+      <w:pPr>
+        <w:ind w:left="720" w:hanging="360"/>
+      </w:pPr>
+      <w:rPr>
+        <w:rFonts w:hint="default"/>
+      </w:rPr>
+    </w:lvl>
+    <w:lvl w:ilvl="1" w:tplc="20000019">
+      <w:start w:val="1"/>
+      <w:numFmt w:val="lowerLetter"/>
+      <w:lvlText w:val="%2."/>
+      <w:lvlJc w:val="left"/>
+      <w:pPr>
+        <w:ind w:left="1440" w:hanging="360"/>
+      </w:pPr>
+    </w:lvl>
+    <w:lvl w:ilvl="2" w:tplc="2000001B" w:tentative="1">
+      <w:start w:val="1"/>
+      <w:numFmt w:val="lowerRoman"/>
+      <w:lvlText w:val="%3."/>
+      <w:lvlJc w:val="right"/>
+      <w:pPr>
+        <w:ind w:left="2160" w:hanging="180"/>
+      </w:pPr>
+    </w:lvl>
+    <w:lvl w:ilvl="3" w:tplc="2000000F" w:tentative="1">
+      <w:start w:val="1"/>
+      <w:numFmt w:val="decimal"/>
+      <w:lvlText w:val="%4."/>
+      <w:lvlJc w:val="left"/>
+      <w:pPr>
+        <w:ind w:left="2880" w:hanging="360"/>
+      </w:pPr>
+    </w:lvl>
+    <w:lvl w:ilvl="4" w:tplc="20000019" w:tentative="1">
+      <w:start w:val="1"/>
+      <w:numFmt w:val="lowerLetter"/>
+      <w:lvlText w:val="%5."/>
+      <w:lvlJc w:val="left"/>
+      <w:pPr>
+        <w:ind w:left="3600" w:hanging="360"/>
+      </w:pPr>
+    </w:lvl>
+    <w:lvl w:ilvl="5" w:tplc="2000001B" w:tentative="1">
+      <w:start w:val="1"/>
+      <w:numFmt w:val="lowerRoman"/>
+      <w:lvlText w:val="%6."/>
+      <w:lvlJc w:val="right"/>
+      <w:pPr>
+        <w:ind w:left="4320" w:hanging="180"/>
+      </w:pPr>
+    </w:lvl>
+    <w:lvl w:ilvl="6" w:tplc="2000000F" w:tentative="1">
+      <w:start w:val="1"/>
+      <w:numFmt w:val="decimal"/>
+      <w:lvlText w:val="%7."/>
+      <w:lvlJc w:val="left"/>
+      <w:pPr>
+        <w:ind w:left="5040" w:hanging="360"/>
+      </w:pPr>
+    </w:lvl>
+    <w:lvl w:ilvl="7" w:tplc="20000019" w:tentative="1">
+      <w:start w:val="1"/>
+      <w:numFmt w:val="lowerLetter"/>
+      <w:lvlText w:val="%8."/>
+      <w:lvlJc w:val="left"/>
+      <w:pPr>
+        <w:ind w:left="5760" w:hanging="360"/>
+      </w:pPr>
+    </w:lvl>
+    <w:lvl w:ilvl="8" w:tplc="2000001B" w:tentative="1">
+      <w:start w:val="1"/>
+      <w:numFmt w:val="lowerRoman"/>
+      <w:lvlText w:val="%9."/>
+      <w:lvlJc w:val="right"/>
+      <w:pPr>
+        <w:ind w:left="6480" w:hanging="180"/>
+      </w:pPr>
+    </w:lvl>
+  </w:abstractNum>
+  <w:abstractNum w:abstractNumId="1" w15:restartNumberingAfterBreak="0">
     <w:nsid w:val="173049BA"/>
     <w:multiLevelType w:val="multilevel"/>
     <w:tmpl w:val="2DC2E234"/>
@@ -676,7 +1076,96 @@
       </w:rPr>
     </w:lvl>
   </w:abstractNum>
-  <w:abstractNum w:abstractNumId="1" w15:restartNumberingAfterBreak="0">
+  <w:abstractNum w:abstractNumId="2" w15:restartNumberingAfterBreak="0">
+    <w:nsid w:val="1C5815A2"/>
+    <w:multiLevelType w:val="hybridMultilevel"/>
+    <w:tmpl w:val="F4E223FE"/>
+    <w:lvl w:ilvl="0" w:tplc="2000000F">
+      <w:start w:val="1"/>
+      <w:numFmt w:val="decimal"/>
+      <w:lvlText w:val="%1."/>
+      <w:lvlJc w:val="left"/>
+      <w:pPr>
+        <w:ind w:left="720" w:hanging="360"/>
+      </w:pPr>
+      <w:rPr>
+        <w:rFonts w:hint="default"/>
+      </w:rPr>
+    </w:lvl>
+    <w:lvl w:ilvl="1" w:tplc="20000019">
+      <w:start w:val="1"/>
+      <w:numFmt w:val="lowerLetter"/>
+      <w:lvlText w:val="%2."/>
+      <w:lvlJc w:val="left"/>
+      <w:pPr>
+        <w:ind w:left="1440" w:hanging="360"/>
+      </w:pPr>
+    </w:lvl>
+    <w:lvl w:ilvl="2" w:tplc="2000001B" w:tentative="1">
+      <w:start w:val="1"/>
+      <w:numFmt w:val="lowerRoman"/>
+      <w:lvlText w:val="%3."/>
+      <w:lvlJc w:val="right"/>
+      <w:pPr>
+        <w:ind w:left="2160" w:hanging="180"/>
+      </w:pPr>
+    </w:lvl>
+    <w:lvl w:ilvl="3" w:tplc="2000000F" w:tentative="1">
+      <w:start w:val="1"/>
+      <w:numFmt w:val="decimal"/>
+      <w:lvlText w:val="%4."/>
+      <w:lvlJc w:val="left"/>
+      <w:pPr>
+        <w:ind w:left="2880" w:hanging="360"/>
+      </w:pPr>
+    </w:lvl>
+    <w:lvl w:ilvl="4" w:tplc="20000019" w:tentative="1">
+      <w:start w:val="1"/>
+      <w:numFmt w:val="lowerLetter"/>
+      <w:lvlText w:val="%5."/>
+      <w:lvlJc w:val="left"/>
+      <w:pPr>
+        <w:ind w:left="3600" w:hanging="360"/>
+      </w:pPr>
+    </w:lvl>
+    <w:lvl w:ilvl="5" w:tplc="2000001B" w:tentative="1">
+      <w:start w:val="1"/>
+      <w:numFmt w:val="lowerRoman"/>
+      <w:lvlText w:val="%6."/>
+      <w:lvlJc w:val="right"/>
+      <w:pPr>
+        <w:ind w:left="4320" w:hanging="180"/>
+      </w:pPr>
+    </w:lvl>
+    <w:lvl w:ilvl="6" w:tplc="2000000F" w:tentative="1">
+      <w:start w:val="1"/>
+      <w:numFmt w:val="decimal"/>
+      <w:lvlText w:val="%7."/>
+      <w:lvlJc w:val="left"/>
+      <w:pPr>
+        <w:ind w:left="5040" w:hanging="360"/>
+      </w:pPr>
+    </w:lvl>
+    <w:lvl w:ilvl="7" w:tplc="20000019" w:tentative="1">
+      <w:start w:val="1"/>
+      <w:numFmt w:val="lowerLetter"/>
+      <w:lvlText w:val="%8."/>
+      <w:lvlJc w:val="left"/>
+      <w:pPr>
+        <w:ind w:left="5760" w:hanging="360"/>
+      </w:pPr>
+    </w:lvl>
+    <w:lvl w:ilvl="8" w:tplc="2000001B" w:tentative="1">
+      <w:start w:val="1"/>
+      <w:numFmt w:val="lowerRoman"/>
+      <w:lvlText w:val="%9."/>
+      <w:lvlJc w:val="right"/>
+      <w:pPr>
+        <w:ind w:left="6480" w:hanging="180"/>
+      </w:pPr>
+    </w:lvl>
+  </w:abstractNum>
+  <w:abstractNum w:abstractNumId="3" w15:restartNumberingAfterBreak="0">
     <w:nsid w:val="370F0930"/>
     <w:multiLevelType w:val="hybridMultilevel"/>
     <w:tmpl w:val="24261298"/>
@@ -765,7 +1254,7 @@
       </w:pPr>
     </w:lvl>
   </w:abstractNum>
-  <w:abstractNum w:abstractNumId="2" w15:restartNumberingAfterBreak="0">
+  <w:abstractNum w:abstractNumId="4" w15:restartNumberingAfterBreak="0">
     <w:nsid w:val="3C171079"/>
     <w:multiLevelType w:val="hybridMultilevel"/>
     <w:tmpl w:val="602848B8"/>
@@ -851,7 +1340,7 @@
       </w:pPr>
     </w:lvl>
   </w:abstractNum>
-  <w:abstractNum w:abstractNumId="3" w15:restartNumberingAfterBreak="0">
+  <w:abstractNum w:abstractNumId="5" w15:restartNumberingAfterBreak="0">
     <w:nsid w:val="4B3D1744"/>
     <w:multiLevelType w:val="hybridMultilevel"/>
     <w:tmpl w:val="5FACA96A"/>
@@ -937,7 +1426,7 @@
       </w:pPr>
     </w:lvl>
   </w:abstractNum>
-  <w:abstractNum w:abstractNumId="4" w15:restartNumberingAfterBreak="0">
+  <w:abstractNum w:abstractNumId="6" w15:restartNumberingAfterBreak="0">
     <w:nsid w:val="64B078EA"/>
     <w:multiLevelType w:val="hybridMultilevel"/>
     <w:tmpl w:val="12048108"/>
@@ -1026,7 +1515,7 @@
       </w:pPr>
     </w:lvl>
   </w:abstractNum>
-  <w:abstractNum w:abstractNumId="5" w15:restartNumberingAfterBreak="0">
+  <w:abstractNum w:abstractNumId="7" w15:restartNumberingAfterBreak="0">
     <w:nsid w:val="6716095C"/>
     <w:multiLevelType w:val="hybridMultilevel"/>
     <w:tmpl w:val="94B2E512"/>
@@ -1115,7 +1604,96 @@
       </w:pPr>
     </w:lvl>
   </w:abstractNum>
-  <w:abstractNum w:abstractNumId="6" w15:restartNumberingAfterBreak="0">
+  <w:abstractNum w:abstractNumId="8" w15:restartNumberingAfterBreak="0">
+    <w:nsid w:val="694B229B"/>
+    <w:multiLevelType w:val="hybridMultilevel"/>
+    <w:tmpl w:val="5D80830E"/>
+    <w:lvl w:ilvl="0" w:tplc="2000000F">
+      <w:start w:val="1"/>
+      <w:numFmt w:val="decimal"/>
+      <w:lvlText w:val="%1."/>
+      <w:lvlJc w:val="left"/>
+      <w:pPr>
+        <w:ind w:left="720" w:hanging="360"/>
+      </w:pPr>
+      <w:rPr>
+        <w:rFonts w:hint="default"/>
+      </w:rPr>
+    </w:lvl>
+    <w:lvl w:ilvl="1" w:tplc="20000019">
+      <w:start w:val="1"/>
+      <w:numFmt w:val="lowerLetter"/>
+      <w:lvlText w:val="%2."/>
+      <w:lvlJc w:val="left"/>
+      <w:pPr>
+        <w:ind w:left="1440" w:hanging="360"/>
+      </w:pPr>
+    </w:lvl>
+    <w:lvl w:ilvl="2" w:tplc="2000001B" w:tentative="1">
+      <w:start w:val="1"/>
+      <w:numFmt w:val="lowerRoman"/>
+      <w:lvlText w:val="%3."/>
+      <w:lvlJc w:val="right"/>
+      <w:pPr>
+        <w:ind w:left="2160" w:hanging="180"/>
+      </w:pPr>
+    </w:lvl>
+    <w:lvl w:ilvl="3" w:tplc="2000000F" w:tentative="1">
+      <w:start w:val="1"/>
+      <w:numFmt w:val="decimal"/>
+      <w:lvlText w:val="%4."/>
+      <w:lvlJc w:val="left"/>
+      <w:pPr>
+        <w:ind w:left="2880" w:hanging="360"/>
+      </w:pPr>
+    </w:lvl>
+    <w:lvl w:ilvl="4" w:tplc="20000019" w:tentative="1">
+      <w:start w:val="1"/>
+      <w:numFmt w:val="lowerLetter"/>
+      <w:lvlText w:val="%5."/>
+      <w:lvlJc w:val="left"/>
+      <w:pPr>
+        <w:ind w:left="3600" w:hanging="360"/>
+      </w:pPr>
+    </w:lvl>
+    <w:lvl w:ilvl="5" w:tplc="2000001B" w:tentative="1">
+      <w:start w:val="1"/>
+      <w:numFmt w:val="lowerRoman"/>
+      <w:lvlText w:val="%6."/>
+      <w:lvlJc w:val="right"/>
+      <w:pPr>
+        <w:ind w:left="4320" w:hanging="180"/>
+      </w:pPr>
+    </w:lvl>
+    <w:lvl w:ilvl="6" w:tplc="2000000F" w:tentative="1">
+      <w:start w:val="1"/>
+      <w:numFmt w:val="decimal"/>
+      <w:lvlText w:val="%7."/>
+      <w:lvlJc w:val="left"/>
+      <w:pPr>
+        <w:ind w:left="5040" w:hanging="360"/>
+      </w:pPr>
+    </w:lvl>
+    <w:lvl w:ilvl="7" w:tplc="20000019" w:tentative="1">
+      <w:start w:val="1"/>
+      <w:numFmt w:val="lowerLetter"/>
+      <w:lvlText w:val="%8."/>
+      <w:lvlJc w:val="left"/>
+      <w:pPr>
+        <w:ind w:left="5760" w:hanging="360"/>
+      </w:pPr>
+    </w:lvl>
+    <w:lvl w:ilvl="8" w:tplc="2000001B" w:tentative="1">
+      <w:start w:val="1"/>
+      <w:numFmt w:val="lowerRoman"/>
+      <w:lvlText w:val="%9."/>
+      <w:lvlJc w:val="right"/>
+      <w:pPr>
+        <w:ind w:left="6480" w:hanging="180"/>
+      </w:pPr>
+    </w:lvl>
+  </w:abstractNum>
+  <w:abstractNum w:abstractNumId="9" w15:restartNumberingAfterBreak="0">
     <w:nsid w:val="702C2022"/>
     <w:multiLevelType w:val="multilevel"/>
     <w:tmpl w:val="C3B0DA04"/>
@@ -1265,25 +1843,34 @@
     </w:lvl>
   </w:abstractNum>
   <w:num w:numId="1" w16cid:durableId="1455716257">
+    <w:abstractNumId w:val="4"/>
+  </w:num>
+  <w:num w:numId="2" w16cid:durableId="1419139022">
+    <w:abstractNumId w:val="5"/>
+  </w:num>
+  <w:num w:numId="3" w16cid:durableId="674068291">
+    <w:abstractNumId w:val="6"/>
+  </w:num>
+  <w:num w:numId="4" w16cid:durableId="1929995160">
+    <w:abstractNumId w:val="3"/>
+  </w:num>
+  <w:num w:numId="5" w16cid:durableId="647714079">
+    <w:abstractNumId w:val="7"/>
+  </w:num>
+  <w:num w:numId="6" w16cid:durableId="1084186349">
+    <w:abstractNumId w:val="1"/>
+  </w:num>
+  <w:num w:numId="7" w16cid:durableId="918252329">
+    <w:abstractNumId w:val="9"/>
+  </w:num>
+  <w:num w:numId="8" w16cid:durableId="999425976">
+    <w:abstractNumId w:val="0"/>
+  </w:num>
+  <w:num w:numId="9" w16cid:durableId="68575211">
     <w:abstractNumId w:val="2"/>
   </w:num>
-  <w:num w:numId="2" w16cid:durableId="1419139022">
-    <w:abstractNumId w:val="3"/>
-  </w:num>
-  <w:num w:numId="3" w16cid:durableId="674068291">
-    <w:abstractNumId w:val="4"/>
-  </w:num>
-  <w:num w:numId="4" w16cid:durableId="1929995160">
-    <w:abstractNumId w:val="1"/>
-  </w:num>
-  <w:num w:numId="5" w16cid:durableId="647714079">
-    <w:abstractNumId w:val="5"/>
-  </w:num>
-  <w:num w:numId="6" w16cid:durableId="1084186349">
-    <w:abstractNumId w:val="0"/>
-  </w:num>
-  <w:num w:numId="7" w16cid:durableId="918252329">
-    <w:abstractNumId w:val="6"/>
+  <w:num w:numId="10" w16cid:durableId="1260599156">
+    <w:abstractNumId w:val="8"/>
   </w:num>
 </w:numbering>
 </file>
@@ -1892,6 +2479,7 @@
   <w:style w:type="character" w:default="1" w:styleId="DefaultParagraphFont">
     <w:name w:val="Default Paragraph Font"/>
     <w:uiPriority w:val="1"/>
+    <w:semiHidden/>
     <w:unhideWhenUsed/>
   </w:style>
   <w:style w:type="table" w:default="1" w:styleId="TableNormal">

</xml_diff>